<commit_message>
feat(m365-copilot-universal): update demo files 2026-06-30 09:06
</commit_message>
<xml_diff>
--- a/M365-Copilot-Universal/d14 - Teams Facilitator Recap E2E/Facilitator_E2E_Click_Guide.docx
+++ b/M365-Copilot-Universal/d14 - Teams Facilitator Recap E2E/Facilitator_E2E_Click_Guide.docx
@@ -72,7 +72,7 @@
         <w:pStyle w:val="ListBullet"/>
       </w:pPr>
       <w:r>
-        <w:t>Audio recap uses meeting transcripts, can include up to 8 meetings, is stored in OneDrive, and expires after 60 days.</w:t>
+        <w:t>Audio recap is generated through Teams Meet / Recap entry points, uses meeting transcripts, can include up to 8 meetings, is stored in OneDrive, and expires after 60 days.</w:t>
       </w:r>
     </w:p>
     <w:p>
@@ -88,7 +88,7 @@
         <w:pStyle w:val="ListBullet"/>
       </w:pPr>
       <w:r>
-        <w:t>Copilot Notebooks Audio overview requires at least one notebook reference file and is created from Quick create &gt; Audio overview.</w:t>
+        <w:t>Copilot Notebooks Audio overview is not a chat prompt. It requires at least one notebook reference file and is created from Created content &gt; Quick create &gt; Audio overview.</w:t>
       </w:r>
     </w:p>
     <w:p>
@@ -268,7 +268,7 @@
         <w:rPr>
           <w:color w:val="202020"/>
         </w:rPr>
-        <w:t>Part 4 - Audio Recap</w:t>
+        <w:t>Part 4 - Audio Recap (click path, not prompt)</w:t>
       </w:r>
     </w:p>
     <w:p>
@@ -308,7 +308,7 @@
         <w:pStyle w:val="ListNumber"/>
       </w:pPr>
       <w:r>
-        <w:t>Select Generate.</w:t>
+        <w:t>Select Generate. Do not paste a prompt; the recap is generated from the selected transcribed meetings and chosen style.</w:t>
       </w:r>
     </w:p>
     <w:p>
@@ -370,7 +370,7 @@
         <w:rPr>
           <w:color w:val="202020"/>
         </w:rPr>
-        <w:t>Part 6 - Notebook Audio Overview</w:t>
+        <w:t>Part 6 - Notebook Audio Overview (click path, not prompt)</w:t>
       </w:r>
     </w:p>
     <w:p>
@@ -394,7 +394,7 @@
         <w:pStyle w:val="ListNumber"/>
       </w:pPr>
       <w:r>
-        <w:t>In the notebook left pane, select Quick create under Created content.</w:t>
+        <w:t>In the notebook left pane, go to Created content and select Quick create.</w:t>
       </w:r>
     </w:p>
     <w:p>
@@ -410,7 +410,7 @@
         <w:pStyle w:val="ListNumber"/>
       </w:pPr>
       <w:r>
-        <w:t>Use this as the podcast moment: Copilot turns the project context into a listenable overview.</w:t>
+        <w:t>Use this as the podcast moment: Copilot turns the project context into a listenable overview without prompt engineering.</w:t>
       </w:r>
     </w:p>
     <w:p>

</xml_diff>